<commit_message>
Nederlands: samenvattingen toegevoegd aan examen 2
Co-Authored-By: Claude Sonnet 4.6 <noreply@anthropic.com>
</commit_message>
<xml_diff>
--- a/02 - Projectmanagement/03 - Opdrachten/01 - Eindproject/02 - Gedetailleerd voorstel/Projectmanagement Eindproject Gedetailleerd voorstel.docx
+++ b/02 - Projectmanagement/03 - Opdrachten/01 - Eindproject/02 - Gedetailleerd voorstel/Projectmanagement Eindproject Gedetailleerd voorstel.docx
@@ -653,15 +653,24 @@
       </w:hyperlink>
     </w:p>
     <w:p>
+      <w:pPr>
+        <w:rPr>
+          <w:lang w:val="en-US"/>
+        </w:rPr>
+      </w:pPr>
       <w:hyperlink r:id="rId9" w:history="1">
         <w:r>
           <w:rPr>
             <w:rStyle w:val="Hyperlink"/>
+            <w:lang w:val="en-US"/>
           </w:rPr>
           <w:t>sitesolutions.contact@gmail.com</w:t>
         </w:r>
       </w:hyperlink>
       <w:r>
+        <w:rPr>
+          <w:lang w:val="en-US"/>
+        </w:rPr>
         <w:t xml:space="preserve"> </w:t>
       </w:r>
     </w:p>
@@ -799,12 +808,14 @@
         <w:rPr>
           <w:sz w:val="22"/>
           <w:szCs w:val="22"/>
-        </w:rPr>
-      </w:pPr>
-      <w:r>
-        <w:rPr>
-          <w:sz w:val="22"/>
-          <w:szCs w:val="22"/>
+          <w:highlight w:val="yellow"/>
+        </w:rPr>
+      </w:pPr>
+      <w:r>
+        <w:rPr>
+          <w:sz w:val="22"/>
+          <w:szCs w:val="22"/>
+          <w:highlight w:val="yellow"/>
         </w:rPr>
         <w:t xml:space="preserve">US001: </w:t>
       </w:r>
@@ -820,12 +831,14 @@
         <w:rPr>
           <w:sz w:val="22"/>
           <w:szCs w:val="22"/>
-        </w:rPr>
-      </w:pPr>
-      <w:r>
-        <w:rPr>
-          <w:sz w:val="22"/>
-          <w:szCs w:val="22"/>
+          <w:highlight w:val="yellow"/>
+        </w:rPr>
+      </w:pPr>
+      <w:r>
+        <w:rPr>
+          <w:sz w:val="22"/>
+          <w:szCs w:val="22"/>
+          <w:highlight w:val="yellow"/>
         </w:rPr>
         <w:t>ALS gebruiker</w:t>
       </w:r>
@@ -833,6 +846,7 @@
         <w:rPr>
           <w:sz w:val="22"/>
           <w:szCs w:val="22"/>
+          <w:highlight w:val="yellow"/>
         </w:rPr>
         <w:t xml:space="preserve"> </w:t>
       </w:r>
@@ -848,12 +862,14 @@
         <w:rPr>
           <w:sz w:val="22"/>
           <w:szCs w:val="22"/>
-        </w:rPr>
-      </w:pPr>
-      <w:r>
-        <w:rPr>
-          <w:sz w:val="22"/>
-          <w:szCs w:val="22"/>
+          <w:highlight w:val="yellow"/>
+        </w:rPr>
+      </w:pPr>
+      <w:r>
+        <w:rPr>
+          <w:sz w:val="22"/>
+          <w:szCs w:val="22"/>
+          <w:highlight w:val="yellow"/>
         </w:rPr>
         <w:t>WIL IK kunnen registreren met email en wachtwoord</w:t>
       </w:r>
@@ -861,6 +877,7 @@
         <w:rPr>
           <w:sz w:val="22"/>
           <w:szCs w:val="22"/>
+          <w:highlight w:val="yellow"/>
         </w:rPr>
         <w:t xml:space="preserve"> </w:t>
       </w:r>
@@ -882,6 +899,7 @@
         <w:rPr>
           <w:sz w:val="22"/>
           <w:szCs w:val="22"/>
+          <w:highlight w:val="yellow"/>
         </w:rPr>
         <w:t>ZODAT IK toegang krijg tot de documentenkluis</w:t>
       </w:r>
@@ -889,6 +907,7 @@
         <w:rPr>
           <w:sz w:val="22"/>
           <w:szCs w:val="22"/>
+          <w:highlight w:val="yellow"/>
         </w:rPr>
         <w:t>.</w:t>
       </w:r>
@@ -913,12 +932,14 @@
         <w:rPr>
           <w:sz w:val="22"/>
           <w:szCs w:val="22"/>
-        </w:rPr>
-      </w:pPr>
-      <w:r>
-        <w:rPr>
-          <w:sz w:val="22"/>
-          <w:szCs w:val="22"/>
+          <w:highlight w:val="yellow"/>
+        </w:rPr>
+      </w:pPr>
+      <w:r>
+        <w:rPr>
+          <w:sz w:val="22"/>
+          <w:szCs w:val="22"/>
+          <w:highlight w:val="yellow"/>
         </w:rPr>
         <w:t xml:space="preserve">US002: </w:t>
       </w:r>
@@ -934,12 +955,14 @@
         <w:rPr>
           <w:sz w:val="22"/>
           <w:szCs w:val="22"/>
-        </w:rPr>
-      </w:pPr>
-      <w:r>
-        <w:rPr>
-          <w:sz w:val="22"/>
-          <w:szCs w:val="22"/>
+          <w:highlight w:val="yellow"/>
+        </w:rPr>
+      </w:pPr>
+      <w:r>
+        <w:rPr>
+          <w:sz w:val="22"/>
+          <w:szCs w:val="22"/>
+          <w:highlight w:val="yellow"/>
         </w:rPr>
         <w:t xml:space="preserve">ALS gebruiker </w:t>
       </w:r>
@@ -955,12 +978,14 @@
         <w:rPr>
           <w:sz w:val="22"/>
           <w:szCs w:val="22"/>
-        </w:rPr>
-      </w:pPr>
-      <w:r>
-        <w:rPr>
-          <w:sz w:val="22"/>
-          <w:szCs w:val="22"/>
+          <w:highlight w:val="yellow"/>
+        </w:rPr>
+      </w:pPr>
+      <w:r>
+        <w:rPr>
+          <w:sz w:val="22"/>
+          <w:szCs w:val="22"/>
+          <w:highlight w:val="yellow"/>
         </w:rPr>
         <w:t xml:space="preserve">WIL IK kunnen inloggen met mijn gegevens </w:t>
       </w:r>
@@ -982,6 +1007,7 @@
         <w:rPr>
           <w:sz w:val="22"/>
           <w:szCs w:val="22"/>
+          <w:highlight w:val="yellow"/>
         </w:rPr>
         <w:t xml:space="preserve">ZODAT Ik bij </w:t>
       </w:r>
@@ -989,6 +1015,7 @@
         <w:rPr>
           <w:sz w:val="22"/>
           <w:szCs w:val="22"/>
+          <w:highlight w:val="yellow"/>
         </w:rPr>
         <w:t>mijn documenten kan</w:t>
       </w:r>
@@ -996,6 +1023,7 @@
         <w:rPr>
           <w:sz w:val="22"/>
           <w:szCs w:val="22"/>
+          <w:highlight w:val="yellow"/>
         </w:rPr>
         <w:t>.</w:t>
       </w:r>
@@ -1020,12 +1048,14 @@
         <w:rPr>
           <w:sz w:val="22"/>
           <w:szCs w:val="22"/>
-        </w:rPr>
-      </w:pPr>
-      <w:r>
-        <w:rPr>
-          <w:sz w:val="22"/>
-          <w:szCs w:val="22"/>
+          <w:highlight w:val="yellow"/>
+        </w:rPr>
+      </w:pPr>
+      <w:r>
+        <w:rPr>
+          <w:sz w:val="22"/>
+          <w:szCs w:val="22"/>
+          <w:highlight w:val="yellow"/>
         </w:rPr>
         <w:t xml:space="preserve">US003: </w:t>
       </w:r>
@@ -1041,12 +1071,14 @@
         <w:rPr>
           <w:sz w:val="22"/>
           <w:szCs w:val="22"/>
-        </w:rPr>
-      </w:pPr>
-      <w:r>
-        <w:rPr>
-          <w:sz w:val="22"/>
-          <w:szCs w:val="22"/>
+          <w:highlight w:val="yellow"/>
+        </w:rPr>
+      </w:pPr>
+      <w:r>
+        <w:rPr>
+          <w:sz w:val="22"/>
+          <w:szCs w:val="22"/>
+          <w:highlight w:val="yellow"/>
         </w:rPr>
         <w:t xml:space="preserve">ALS gebruiker </w:t>
       </w:r>
@@ -1062,12 +1094,14 @@
         <w:rPr>
           <w:sz w:val="22"/>
           <w:szCs w:val="22"/>
-        </w:rPr>
-      </w:pPr>
-      <w:r>
-        <w:rPr>
-          <w:sz w:val="22"/>
-          <w:szCs w:val="22"/>
+          <w:highlight w:val="yellow"/>
+        </w:rPr>
+      </w:pPr>
+      <w:r>
+        <w:rPr>
+          <w:sz w:val="22"/>
+          <w:szCs w:val="22"/>
+          <w:highlight w:val="yellow"/>
         </w:rPr>
         <w:t>WIL IK</w:t>
       </w:r>
@@ -1075,6 +1109,7 @@
         <w:rPr>
           <w:sz w:val="22"/>
           <w:szCs w:val="22"/>
+          <w:highlight w:val="yellow"/>
         </w:rPr>
         <w:t xml:space="preserve"> mijn gegevens kunnen wijzigen </w:t>
       </w:r>
@@ -1096,6 +1131,7 @@
         <w:rPr>
           <w:sz w:val="22"/>
           <w:szCs w:val="22"/>
+          <w:highlight w:val="yellow"/>
         </w:rPr>
         <w:t>ZODAT</w:t>
       </w:r>
@@ -1103,6 +1139,7 @@
         <w:rPr>
           <w:sz w:val="22"/>
           <w:szCs w:val="22"/>
+          <w:highlight w:val="yellow"/>
         </w:rPr>
         <w:t xml:space="preserve"> ik</w:t>
       </w:r>
@@ -1110,6 +1147,7 @@
         <w:rPr>
           <w:sz w:val="22"/>
           <w:szCs w:val="22"/>
+          <w:highlight w:val="yellow"/>
         </w:rPr>
         <w:t xml:space="preserve"> mijn account up-to-date </w:t>
       </w:r>
@@ -1117,6 +1155,7 @@
         <w:rPr>
           <w:sz w:val="22"/>
           <w:szCs w:val="22"/>
+          <w:highlight w:val="yellow"/>
         </w:rPr>
         <w:t>kan houden</w:t>
       </w:r>
@@ -1124,6 +1163,7 @@
         <w:rPr>
           <w:sz w:val="22"/>
           <w:szCs w:val="22"/>
+          <w:highlight w:val="yellow"/>
         </w:rPr>
         <w:t>.</w:t>
       </w:r>
@@ -1147,12 +1187,14 @@
         <w:rPr>
           <w:sz w:val="22"/>
           <w:szCs w:val="22"/>
-        </w:rPr>
-      </w:pPr>
-      <w:r>
-        <w:rPr>
-          <w:sz w:val="22"/>
-          <w:szCs w:val="22"/>
+          <w:highlight w:val="yellow"/>
+        </w:rPr>
+      </w:pPr>
+      <w:r>
+        <w:rPr>
+          <w:sz w:val="22"/>
+          <w:szCs w:val="22"/>
+          <w:highlight w:val="yellow"/>
         </w:rPr>
         <w:t xml:space="preserve">US004: </w:t>
       </w:r>
@@ -1168,12 +1210,14 @@
         <w:rPr>
           <w:sz w:val="22"/>
           <w:szCs w:val="22"/>
-        </w:rPr>
-      </w:pPr>
-      <w:r>
-        <w:rPr>
-          <w:sz w:val="22"/>
-          <w:szCs w:val="22"/>
+          <w:highlight w:val="yellow"/>
+        </w:rPr>
+      </w:pPr>
+      <w:r>
+        <w:rPr>
+          <w:sz w:val="22"/>
+          <w:szCs w:val="22"/>
+          <w:highlight w:val="yellow"/>
         </w:rPr>
         <w:t xml:space="preserve">ALS gebruiker </w:t>
       </w:r>
@@ -1189,12 +1233,14 @@
         <w:rPr>
           <w:sz w:val="22"/>
           <w:szCs w:val="22"/>
-        </w:rPr>
-      </w:pPr>
-      <w:r>
-        <w:rPr>
-          <w:sz w:val="22"/>
-          <w:szCs w:val="22"/>
+          <w:highlight w:val="yellow"/>
+        </w:rPr>
+      </w:pPr>
+      <w:r>
+        <w:rPr>
+          <w:sz w:val="22"/>
+          <w:szCs w:val="22"/>
+          <w:highlight w:val="yellow"/>
         </w:rPr>
         <w:t>WIL IK</w:t>
       </w:r>
@@ -1202,6 +1248,7 @@
         <w:rPr>
           <w:sz w:val="22"/>
           <w:szCs w:val="22"/>
+          <w:highlight w:val="yellow"/>
         </w:rPr>
         <w:t xml:space="preserve"> mijn wachtwoord kunnen wijzigen </w:t>
       </w:r>
@@ -1223,6 +1270,7 @@
         <w:rPr>
           <w:sz w:val="22"/>
           <w:szCs w:val="22"/>
+          <w:highlight w:val="yellow"/>
         </w:rPr>
         <w:t>ZODAT IK</w:t>
       </w:r>
@@ -1230,6 +1278,7 @@
         <w:rPr>
           <w:sz w:val="22"/>
           <w:szCs w:val="22"/>
+          <w:highlight w:val="yellow"/>
         </w:rPr>
         <w:t xml:space="preserve"> mijn account veilig kan houden</w:t>
       </w:r>
@@ -1237,6 +1286,7 @@
         <w:rPr>
           <w:sz w:val="22"/>
           <w:szCs w:val="22"/>
+          <w:highlight w:val="yellow"/>
         </w:rPr>
         <w:t>.</w:t>
       </w:r>
@@ -1261,12 +1311,14 @@
         <w:rPr>
           <w:sz w:val="22"/>
           <w:szCs w:val="22"/>
-        </w:rPr>
-      </w:pPr>
-      <w:r>
-        <w:rPr>
-          <w:sz w:val="22"/>
-          <w:szCs w:val="22"/>
+          <w:highlight w:val="yellow"/>
+        </w:rPr>
+      </w:pPr>
+      <w:r>
+        <w:rPr>
+          <w:sz w:val="22"/>
+          <w:szCs w:val="22"/>
+          <w:highlight w:val="yellow"/>
         </w:rPr>
         <w:t xml:space="preserve">US005: </w:t>
       </w:r>
@@ -1282,12 +1334,14 @@
         <w:rPr>
           <w:sz w:val="22"/>
           <w:szCs w:val="22"/>
-        </w:rPr>
-      </w:pPr>
-      <w:r>
-        <w:rPr>
-          <w:sz w:val="22"/>
-          <w:szCs w:val="22"/>
+          <w:highlight w:val="yellow"/>
+        </w:rPr>
+      </w:pPr>
+      <w:r>
+        <w:rPr>
+          <w:sz w:val="22"/>
+          <w:szCs w:val="22"/>
+          <w:highlight w:val="yellow"/>
         </w:rPr>
         <w:t xml:space="preserve">ALS gebruiker </w:t>
       </w:r>
@@ -1303,12 +1357,14 @@
         <w:rPr>
           <w:sz w:val="22"/>
           <w:szCs w:val="22"/>
-        </w:rPr>
-      </w:pPr>
-      <w:r>
-        <w:rPr>
-          <w:sz w:val="22"/>
-          <w:szCs w:val="22"/>
+          <w:highlight w:val="yellow"/>
+        </w:rPr>
+      </w:pPr>
+      <w:r>
+        <w:rPr>
+          <w:sz w:val="22"/>
+          <w:szCs w:val="22"/>
+          <w:highlight w:val="yellow"/>
         </w:rPr>
         <w:t>WIL IK</w:t>
       </w:r>
@@ -1316,6 +1372,7 @@
         <w:rPr>
           <w:sz w:val="22"/>
           <w:szCs w:val="22"/>
+          <w:highlight w:val="yellow"/>
         </w:rPr>
         <w:t xml:space="preserve"> mijn account volledig kunnen verwijderen </w:t>
       </w:r>
@@ -1337,6 +1394,7 @@
         <w:rPr>
           <w:sz w:val="22"/>
           <w:szCs w:val="22"/>
+          <w:highlight w:val="yellow"/>
         </w:rPr>
         <w:t>ZODAT IK</w:t>
       </w:r>
@@ -1344,6 +1402,7 @@
         <w:rPr>
           <w:sz w:val="22"/>
           <w:szCs w:val="22"/>
+          <w:highlight w:val="yellow"/>
         </w:rPr>
         <w:t xml:space="preserve"> mijn gegevens </w:t>
       </w:r>
@@ -1351,6 +1410,7 @@
         <w:rPr>
           <w:sz w:val="22"/>
           <w:szCs w:val="22"/>
+          <w:highlight w:val="yellow"/>
         </w:rPr>
         <w:t>kan</w:t>
       </w:r>
@@ -1358,6 +1418,7 @@
         <w:rPr>
           <w:sz w:val="22"/>
           <w:szCs w:val="22"/>
+          <w:highlight w:val="yellow"/>
         </w:rPr>
         <w:t xml:space="preserve"> </w:t>
       </w:r>
@@ -1365,6 +1426,7 @@
         <w:rPr>
           <w:sz w:val="22"/>
           <w:szCs w:val="22"/>
+          <w:highlight w:val="yellow"/>
         </w:rPr>
         <w:t>wissen</w:t>
       </w:r>
@@ -1372,6 +1434,7 @@
         <w:rPr>
           <w:sz w:val="22"/>
           <w:szCs w:val="22"/>
+          <w:highlight w:val="yellow"/>
         </w:rPr>
         <w:t xml:space="preserve"> wanneer ik </w:t>
       </w:r>
@@ -1379,6 +1442,7 @@
         <w:rPr>
           <w:sz w:val="22"/>
           <w:szCs w:val="22"/>
+          <w:highlight w:val="yellow"/>
         </w:rPr>
         <w:t>de documentenkluis niet meer wil gebruiken</w:t>
       </w:r>
@@ -1386,6 +1450,7 @@
         <w:rPr>
           <w:sz w:val="22"/>
           <w:szCs w:val="22"/>
+          <w:highlight w:val="yellow"/>
         </w:rPr>
         <w:t>.</w:t>
       </w:r>
@@ -1410,12 +1475,14 @@
         <w:rPr>
           <w:sz w:val="22"/>
           <w:szCs w:val="22"/>
-        </w:rPr>
-      </w:pPr>
-      <w:r>
-        <w:rPr>
-          <w:sz w:val="22"/>
-          <w:szCs w:val="22"/>
+          <w:highlight w:val="yellow"/>
+        </w:rPr>
+      </w:pPr>
+      <w:r>
+        <w:rPr>
+          <w:sz w:val="22"/>
+          <w:szCs w:val="22"/>
+          <w:highlight w:val="yellow"/>
         </w:rPr>
         <w:t xml:space="preserve">US006: </w:t>
       </w:r>
@@ -1431,12 +1498,14 @@
         <w:rPr>
           <w:sz w:val="22"/>
           <w:szCs w:val="22"/>
-        </w:rPr>
-      </w:pPr>
-      <w:r>
-        <w:rPr>
-          <w:sz w:val="22"/>
-          <w:szCs w:val="22"/>
+          <w:highlight w:val="yellow"/>
+        </w:rPr>
+      </w:pPr>
+      <w:r>
+        <w:rPr>
+          <w:sz w:val="22"/>
+          <w:szCs w:val="22"/>
+          <w:highlight w:val="yellow"/>
         </w:rPr>
         <w:t>A</w:t>
       </w:r>
@@ -1444,6 +1513,7 @@
         <w:rPr>
           <w:sz w:val="22"/>
           <w:szCs w:val="22"/>
+          <w:highlight w:val="yellow"/>
         </w:rPr>
         <w:t>LS</w:t>
       </w:r>
@@ -1451,6 +1521,7 @@
         <w:rPr>
           <w:sz w:val="22"/>
           <w:szCs w:val="22"/>
+          <w:highlight w:val="yellow"/>
         </w:rPr>
         <w:t xml:space="preserve"> admin </w:t>
       </w:r>
@@ -1466,12 +1537,14 @@
         <w:rPr>
           <w:sz w:val="22"/>
           <w:szCs w:val="22"/>
-        </w:rPr>
-      </w:pPr>
-      <w:r>
-        <w:rPr>
-          <w:sz w:val="22"/>
-          <w:szCs w:val="22"/>
+          <w:highlight w:val="yellow"/>
+        </w:rPr>
+      </w:pPr>
+      <w:r>
+        <w:rPr>
+          <w:sz w:val="22"/>
+          <w:szCs w:val="22"/>
+          <w:highlight w:val="yellow"/>
         </w:rPr>
         <w:t>WIL IK</w:t>
       </w:r>
@@ -1479,6 +1552,7 @@
         <w:rPr>
           <w:sz w:val="22"/>
           <w:szCs w:val="22"/>
+          <w:highlight w:val="yellow"/>
         </w:rPr>
         <w:t xml:space="preserve"> kunnen inloggen met admin-gegevens </w:t>
       </w:r>
@@ -1500,6 +1574,7 @@
         <w:rPr>
           <w:sz w:val="22"/>
           <w:szCs w:val="22"/>
+          <w:highlight w:val="yellow"/>
         </w:rPr>
         <w:t>ZODAT IK het systeem kan beheren.</w:t>
       </w:r>
@@ -1524,12 +1599,14 @@
         <w:rPr>
           <w:sz w:val="22"/>
           <w:szCs w:val="22"/>
-        </w:rPr>
-      </w:pPr>
-      <w:r>
-        <w:rPr>
-          <w:sz w:val="22"/>
-          <w:szCs w:val="22"/>
+          <w:highlight w:val="yellow"/>
+        </w:rPr>
+      </w:pPr>
+      <w:r>
+        <w:rPr>
+          <w:sz w:val="22"/>
+          <w:szCs w:val="22"/>
+          <w:highlight w:val="yellow"/>
         </w:rPr>
         <w:t xml:space="preserve">US007: </w:t>
       </w:r>
@@ -1545,12 +1622,14 @@
         <w:rPr>
           <w:sz w:val="22"/>
           <w:szCs w:val="22"/>
-        </w:rPr>
-      </w:pPr>
-      <w:r>
-        <w:rPr>
-          <w:sz w:val="22"/>
-          <w:szCs w:val="22"/>
+          <w:highlight w:val="yellow"/>
+        </w:rPr>
+      </w:pPr>
+      <w:r>
+        <w:rPr>
+          <w:sz w:val="22"/>
+          <w:szCs w:val="22"/>
+          <w:highlight w:val="yellow"/>
         </w:rPr>
         <w:t>ALS</w:t>
       </w:r>
@@ -1558,6 +1637,7 @@
         <w:rPr>
           <w:sz w:val="22"/>
           <w:szCs w:val="22"/>
+          <w:highlight w:val="yellow"/>
         </w:rPr>
         <w:t xml:space="preserve"> gebruiker </w:t>
       </w:r>
@@ -1573,12 +1653,14 @@
         <w:rPr>
           <w:sz w:val="22"/>
           <w:szCs w:val="22"/>
-        </w:rPr>
-      </w:pPr>
-      <w:r>
-        <w:rPr>
-          <w:sz w:val="22"/>
-          <w:szCs w:val="22"/>
+          <w:highlight w:val="yellow"/>
+        </w:rPr>
+      </w:pPr>
+      <w:r>
+        <w:rPr>
+          <w:sz w:val="22"/>
+          <w:szCs w:val="22"/>
+          <w:highlight w:val="yellow"/>
         </w:rPr>
         <w:t>WIL IK</w:t>
       </w:r>
@@ -1586,6 +1668,7 @@
         <w:rPr>
           <w:sz w:val="22"/>
           <w:szCs w:val="22"/>
+          <w:highlight w:val="yellow"/>
         </w:rPr>
         <w:t xml:space="preserve"> een responsive en gebruiksvriend</w:t>
       </w:r>
@@ -1593,6 +1676,7 @@
         <w:rPr>
           <w:sz w:val="22"/>
           <w:szCs w:val="22"/>
+          <w:highlight w:val="yellow"/>
         </w:rPr>
         <w:t>e</w:t>
       </w:r>
@@ -1600,6 +1684,7 @@
         <w:rPr>
           <w:sz w:val="22"/>
           <w:szCs w:val="22"/>
+          <w:highlight w:val="yellow"/>
         </w:rPr>
         <w:t xml:space="preserve">lijke interface zien </w:t>
       </w:r>
@@ -1621,6 +1706,7 @@
         <w:rPr>
           <w:sz w:val="22"/>
           <w:szCs w:val="22"/>
+          <w:highlight w:val="yellow"/>
         </w:rPr>
         <w:t xml:space="preserve">ZODAT IK </w:t>
       </w:r>
@@ -1628,6 +1714,7 @@
         <w:rPr>
           <w:sz w:val="22"/>
           <w:szCs w:val="22"/>
+          <w:highlight w:val="yellow"/>
         </w:rPr>
         <w:t>de webapplicatie op verschillende apparaten kan gebruiken.</w:t>
       </w:r>
@@ -1704,12 +1791,14 @@
         <w:rPr>
           <w:sz w:val="22"/>
           <w:szCs w:val="22"/>
-        </w:rPr>
-      </w:pPr>
-      <w:r>
-        <w:rPr>
-          <w:sz w:val="22"/>
-          <w:szCs w:val="22"/>
+          <w:highlight w:val="yellow"/>
+        </w:rPr>
+      </w:pPr>
+      <w:r>
+        <w:rPr>
+          <w:sz w:val="22"/>
+          <w:szCs w:val="22"/>
+          <w:highlight w:val="yellow"/>
         </w:rPr>
         <w:t>US</w:t>
       </w:r>
@@ -1717,6 +1806,7 @@
         <w:rPr>
           <w:sz w:val="22"/>
           <w:szCs w:val="22"/>
+          <w:highlight w:val="yellow"/>
         </w:rPr>
         <w:t>008:</w:t>
       </w:r>
@@ -1732,12 +1822,14 @@
         <w:rPr>
           <w:sz w:val="22"/>
           <w:szCs w:val="22"/>
-        </w:rPr>
-      </w:pPr>
-      <w:r>
-        <w:rPr>
-          <w:sz w:val="22"/>
-          <w:szCs w:val="22"/>
+          <w:highlight w:val="yellow"/>
+        </w:rPr>
+      </w:pPr>
+      <w:r>
+        <w:rPr>
+          <w:sz w:val="22"/>
+          <w:szCs w:val="22"/>
+          <w:highlight w:val="yellow"/>
         </w:rPr>
         <w:t xml:space="preserve">ALS gebruiker </w:t>
       </w:r>
@@ -1753,12 +1845,14 @@
         <w:rPr>
           <w:sz w:val="22"/>
           <w:szCs w:val="22"/>
-        </w:rPr>
-      </w:pPr>
-      <w:r>
-        <w:rPr>
-          <w:sz w:val="22"/>
-          <w:szCs w:val="22"/>
+          <w:highlight w:val="yellow"/>
+        </w:rPr>
+      </w:pPr>
+      <w:r>
+        <w:rPr>
+          <w:sz w:val="22"/>
+          <w:szCs w:val="22"/>
+          <w:highlight w:val="yellow"/>
         </w:rPr>
         <w:t xml:space="preserve">WIL IK mappen kunnen aanmaken </w:t>
       </w:r>
@@ -1780,6 +1874,7 @@
         <w:rPr>
           <w:sz w:val="22"/>
           <w:szCs w:val="22"/>
+          <w:highlight w:val="yellow"/>
         </w:rPr>
         <w:t>ZODAT IK mijn documenten georganiseerd kan opslaan.</w:t>
       </w:r>
@@ -1804,12 +1899,14 @@
         <w:rPr>
           <w:sz w:val="22"/>
           <w:szCs w:val="22"/>
-        </w:rPr>
-      </w:pPr>
-      <w:r>
-        <w:rPr>
-          <w:sz w:val="22"/>
-          <w:szCs w:val="22"/>
+          <w:highlight w:val="yellow"/>
+        </w:rPr>
+      </w:pPr>
+      <w:r>
+        <w:rPr>
+          <w:sz w:val="22"/>
+          <w:szCs w:val="22"/>
+          <w:highlight w:val="yellow"/>
         </w:rPr>
         <w:t xml:space="preserve">US009: </w:t>
       </w:r>
@@ -1825,12 +1922,14 @@
         <w:rPr>
           <w:sz w:val="22"/>
           <w:szCs w:val="22"/>
-        </w:rPr>
-      </w:pPr>
-      <w:r>
-        <w:rPr>
-          <w:sz w:val="22"/>
-          <w:szCs w:val="22"/>
+          <w:highlight w:val="yellow"/>
+        </w:rPr>
+      </w:pPr>
+      <w:r>
+        <w:rPr>
+          <w:sz w:val="22"/>
+          <w:szCs w:val="22"/>
+          <w:highlight w:val="yellow"/>
         </w:rPr>
         <w:t xml:space="preserve">ALS gebruiker </w:t>
       </w:r>
@@ -1846,12 +1945,14 @@
         <w:rPr>
           <w:sz w:val="22"/>
           <w:szCs w:val="22"/>
-        </w:rPr>
-      </w:pPr>
-      <w:r>
-        <w:rPr>
-          <w:sz w:val="22"/>
-          <w:szCs w:val="22"/>
+          <w:highlight w:val="yellow"/>
+        </w:rPr>
+      </w:pPr>
+      <w:r>
+        <w:rPr>
+          <w:sz w:val="22"/>
+          <w:szCs w:val="22"/>
+          <w:highlight w:val="yellow"/>
         </w:rPr>
         <w:t>WIL IK</w:t>
       </w:r>
@@ -1859,6 +1960,7 @@
         <w:rPr>
           <w:sz w:val="22"/>
           <w:szCs w:val="22"/>
+          <w:highlight w:val="yellow"/>
         </w:rPr>
         <w:t xml:space="preserve"> mappen kunnen verwijderen </w:t>
       </w:r>
@@ -1880,6 +1982,7 @@
         <w:rPr>
           <w:sz w:val="22"/>
           <w:szCs w:val="22"/>
+          <w:highlight w:val="yellow"/>
         </w:rPr>
         <w:t>ZODAT IK</w:t>
       </w:r>
@@ -1887,6 +1990,7 @@
         <w:rPr>
           <w:sz w:val="22"/>
           <w:szCs w:val="22"/>
+          <w:highlight w:val="yellow"/>
         </w:rPr>
         <w:t xml:space="preserve"> mijn documenten</w:t>
       </w:r>
@@ -1894,6 +1998,7 @@
         <w:rPr>
           <w:sz w:val="22"/>
           <w:szCs w:val="22"/>
+          <w:highlight w:val="yellow"/>
         </w:rPr>
         <w:t>structuur kan onderhouden.</w:t>
       </w:r>
@@ -1918,12 +2023,14 @@
         <w:rPr>
           <w:sz w:val="22"/>
           <w:szCs w:val="22"/>
-        </w:rPr>
-      </w:pPr>
-      <w:r>
-        <w:rPr>
-          <w:sz w:val="22"/>
-          <w:szCs w:val="22"/>
+          <w:highlight w:val="yellow"/>
+        </w:rPr>
+      </w:pPr>
+      <w:r>
+        <w:rPr>
+          <w:sz w:val="22"/>
+          <w:szCs w:val="22"/>
+          <w:highlight w:val="yellow"/>
         </w:rPr>
         <w:t>US010:</w:t>
       </w:r>
@@ -1939,12 +2046,14 @@
         <w:rPr>
           <w:sz w:val="22"/>
           <w:szCs w:val="22"/>
-        </w:rPr>
-      </w:pPr>
-      <w:r>
-        <w:rPr>
-          <w:sz w:val="22"/>
-          <w:szCs w:val="22"/>
+          <w:highlight w:val="yellow"/>
+        </w:rPr>
+      </w:pPr>
+      <w:r>
+        <w:rPr>
+          <w:sz w:val="22"/>
+          <w:szCs w:val="22"/>
+          <w:highlight w:val="yellow"/>
         </w:rPr>
         <w:t xml:space="preserve">ALS gebruiker </w:t>
       </w:r>
@@ -1960,12 +2069,14 @@
         <w:rPr>
           <w:sz w:val="22"/>
           <w:szCs w:val="22"/>
-        </w:rPr>
-      </w:pPr>
-      <w:r>
-        <w:rPr>
-          <w:sz w:val="22"/>
-          <w:szCs w:val="22"/>
+          <w:highlight w:val="yellow"/>
+        </w:rPr>
+      </w:pPr>
+      <w:r>
+        <w:rPr>
+          <w:sz w:val="22"/>
+          <w:szCs w:val="22"/>
+          <w:highlight w:val="yellow"/>
         </w:rPr>
         <w:t>WIL IK</w:t>
       </w:r>
@@ -1973,6 +2084,7 @@
         <w:rPr>
           <w:sz w:val="22"/>
           <w:szCs w:val="22"/>
+          <w:highlight w:val="yellow"/>
         </w:rPr>
         <w:t xml:space="preserve"> lege bestanden kunnen aanmaken </w:t>
       </w:r>
@@ -1994,6 +2106,7 @@
         <w:rPr>
           <w:sz w:val="22"/>
           <w:szCs w:val="22"/>
+          <w:highlight w:val="yellow"/>
         </w:rPr>
         <w:t>ZODAT IK</w:t>
       </w:r>
@@ -2001,6 +2114,7 @@
         <w:rPr>
           <w:sz w:val="22"/>
           <w:szCs w:val="22"/>
+          <w:highlight w:val="yellow"/>
         </w:rPr>
         <w:t xml:space="preserve"> </w:t>
       </w:r>
@@ -2008,6 +2122,7 @@
         <w:rPr>
           <w:sz w:val="22"/>
           <w:szCs w:val="22"/>
+          <w:highlight w:val="yellow"/>
         </w:rPr>
         <w:t>mijn documenten kan voorbereiden.</w:t>
       </w:r>
@@ -2032,12 +2147,14 @@
         <w:rPr>
           <w:sz w:val="22"/>
           <w:szCs w:val="22"/>
-        </w:rPr>
-      </w:pPr>
-      <w:r>
-        <w:rPr>
-          <w:sz w:val="22"/>
-          <w:szCs w:val="22"/>
+          <w:highlight w:val="yellow"/>
+        </w:rPr>
+      </w:pPr>
+      <w:r>
+        <w:rPr>
+          <w:sz w:val="22"/>
+          <w:szCs w:val="22"/>
+          <w:highlight w:val="yellow"/>
         </w:rPr>
         <w:t xml:space="preserve">US011: </w:t>
       </w:r>
@@ -2053,12 +2170,14 @@
         <w:rPr>
           <w:sz w:val="22"/>
           <w:szCs w:val="22"/>
-        </w:rPr>
-      </w:pPr>
-      <w:r>
-        <w:rPr>
-          <w:sz w:val="22"/>
-          <w:szCs w:val="22"/>
+          <w:highlight w:val="yellow"/>
+        </w:rPr>
+      </w:pPr>
+      <w:r>
+        <w:rPr>
+          <w:sz w:val="22"/>
+          <w:szCs w:val="22"/>
+          <w:highlight w:val="yellow"/>
         </w:rPr>
         <w:t xml:space="preserve">ALS gebruiker </w:t>
       </w:r>
@@ -2074,12 +2193,14 @@
         <w:rPr>
           <w:sz w:val="22"/>
           <w:szCs w:val="22"/>
-        </w:rPr>
-      </w:pPr>
-      <w:r>
-        <w:rPr>
-          <w:sz w:val="22"/>
-          <w:szCs w:val="22"/>
+          <w:highlight w:val="yellow"/>
+        </w:rPr>
+      </w:pPr>
+      <w:r>
+        <w:rPr>
+          <w:sz w:val="22"/>
+          <w:szCs w:val="22"/>
+          <w:highlight w:val="yellow"/>
         </w:rPr>
         <w:t xml:space="preserve">WIL IK bestanden kunnen verwijderen </w:t>
       </w:r>
@@ -2101,6 +2222,7 @@
         <w:rPr>
           <w:sz w:val="22"/>
           <w:szCs w:val="22"/>
+          <w:highlight w:val="yellow"/>
         </w:rPr>
         <w:t>ZODAT IK onnodige documenten in de kluis kan o</w:t>
       </w:r>
@@ -2108,6 +2230,7 @@
         <w:rPr>
           <w:sz w:val="22"/>
           <w:szCs w:val="22"/>
+          <w:highlight w:val="yellow"/>
         </w:rPr>
         <w:t>pruimen</w:t>
       </w:r>
@@ -2115,6 +2238,7 @@
         <w:rPr>
           <w:sz w:val="22"/>
           <w:szCs w:val="22"/>
+          <w:highlight w:val="yellow"/>
         </w:rPr>
         <w:t>.</w:t>
       </w:r>
@@ -2139,12 +2263,14 @@
         <w:rPr>
           <w:sz w:val="22"/>
           <w:szCs w:val="22"/>
-        </w:rPr>
-      </w:pPr>
-      <w:r>
-        <w:rPr>
-          <w:sz w:val="22"/>
-          <w:szCs w:val="22"/>
+          <w:highlight w:val="yellow"/>
+        </w:rPr>
+      </w:pPr>
+      <w:r>
+        <w:rPr>
+          <w:sz w:val="22"/>
+          <w:szCs w:val="22"/>
+          <w:highlight w:val="yellow"/>
         </w:rPr>
         <w:t>US012:</w:t>
       </w:r>
@@ -2160,12 +2286,14 @@
         <w:rPr>
           <w:sz w:val="22"/>
           <w:szCs w:val="22"/>
-        </w:rPr>
-      </w:pPr>
-      <w:r>
-        <w:rPr>
-          <w:sz w:val="22"/>
-          <w:szCs w:val="22"/>
+          <w:highlight w:val="yellow"/>
+        </w:rPr>
+      </w:pPr>
+      <w:r>
+        <w:rPr>
+          <w:sz w:val="22"/>
+          <w:szCs w:val="22"/>
+          <w:highlight w:val="yellow"/>
         </w:rPr>
         <w:t xml:space="preserve">ALS gebruiker </w:t>
       </w:r>
@@ -2181,12 +2309,14 @@
         <w:rPr>
           <w:sz w:val="22"/>
           <w:szCs w:val="22"/>
-        </w:rPr>
-      </w:pPr>
-      <w:r>
-        <w:rPr>
-          <w:sz w:val="22"/>
-          <w:szCs w:val="22"/>
+          <w:highlight w:val="yellow"/>
+        </w:rPr>
+      </w:pPr>
+      <w:r>
+        <w:rPr>
+          <w:sz w:val="22"/>
+          <w:szCs w:val="22"/>
+          <w:highlight w:val="yellow"/>
         </w:rPr>
         <w:t>WIL IK</w:t>
       </w:r>
@@ -2194,6 +2324,7 @@
         <w:rPr>
           <w:sz w:val="22"/>
           <w:szCs w:val="22"/>
+          <w:highlight w:val="yellow"/>
         </w:rPr>
         <w:t xml:space="preserve"> bestanden kunnen </w:t>
       </w:r>
@@ -2201,6 +2332,7 @@
         <w:rPr>
           <w:sz w:val="22"/>
           <w:szCs w:val="22"/>
+          <w:highlight w:val="yellow"/>
         </w:rPr>
         <w:t xml:space="preserve">uploaden </w:t>
       </w:r>
@@ -2222,6 +2354,7 @@
         <w:rPr>
           <w:sz w:val="22"/>
           <w:szCs w:val="22"/>
+          <w:highlight w:val="yellow"/>
         </w:rPr>
         <w:t>ZODAT IK</w:t>
       </w:r>
@@ -2229,6 +2362,7 @@
         <w:rPr>
           <w:sz w:val="22"/>
           <w:szCs w:val="22"/>
+          <w:highlight w:val="yellow"/>
         </w:rPr>
         <w:t xml:space="preserve"> mijn documenten in de </w:t>
       </w:r>
@@ -2236,6 +2370,7 @@
         <w:rPr>
           <w:sz w:val="22"/>
           <w:szCs w:val="22"/>
+          <w:highlight w:val="yellow"/>
         </w:rPr>
         <w:t>kluis kan opslaan.</w:t>
       </w:r>
@@ -2260,12 +2395,14 @@
         <w:rPr>
           <w:sz w:val="22"/>
           <w:szCs w:val="22"/>
-        </w:rPr>
-      </w:pPr>
-      <w:r>
-        <w:rPr>
-          <w:sz w:val="22"/>
-          <w:szCs w:val="22"/>
+          <w:highlight w:val="yellow"/>
+        </w:rPr>
+      </w:pPr>
+      <w:r>
+        <w:rPr>
+          <w:sz w:val="22"/>
+          <w:szCs w:val="22"/>
+          <w:highlight w:val="yellow"/>
         </w:rPr>
         <w:t>US013:</w:t>
       </w:r>
@@ -2281,12 +2418,14 @@
         <w:rPr>
           <w:sz w:val="22"/>
           <w:szCs w:val="22"/>
-        </w:rPr>
-      </w:pPr>
-      <w:r>
-        <w:rPr>
-          <w:sz w:val="22"/>
-          <w:szCs w:val="22"/>
+          <w:highlight w:val="yellow"/>
+        </w:rPr>
+      </w:pPr>
+      <w:r>
+        <w:rPr>
+          <w:sz w:val="22"/>
+          <w:szCs w:val="22"/>
+          <w:highlight w:val="yellow"/>
         </w:rPr>
         <w:t xml:space="preserve">ALS gebruiker </w:t>
       </w:r>
@@ -2302,12 +2441,14 @@
         <w:rPr>
           <w:sz w:val="22"/>
           <w:szCs w:val="22"/>
-        </w:rPr>
-      </w:pPr>
-      <w:r>
-        <w:rPr>
-          <w:sz w:val="22"/>
-          <w:szCs w:val="22"/>
+          <w:highlight w:val="yellow"/>
+        </w:rPr>
+      </w:pPr>
+      <w:r>
+        <w:rPr>
+          <w:sz w:val="22"/>
+          <w:szCs w:val="22"/>
+          <w:highlight w:val="yellow"/>
         </w:rPr>
         <w:t xml:space="preserve">WIL IK bestanden kunnen downloaden </w:t>
       </w:r>
@@ -2329,6 +2470,7 @@
         <w:rPr>
           <w:sz w:val="22"/>
           <w:szCs w:val="22"/>
+          <w:highlight w:val="yellow"/>
         </w:rPr>
         <w:t>ZODAT IK mijn documenten lokaal kan bekijken.</w:t>
       </w:r>
@@ -2353,12 +2495,14 @@
         <w:rPr>
           <w:sz w:val="22"/>
           <w:szCs w:val="22"/>
-        </w:rPr>
-      </w:pPr>
-      <w:r>
-        <w:rPr>
-          <w:sz w:val="22"/>
-          <w:szCs w:val="22"/>
+          <w:highlight w:val="yellow"/>
+        </w:rPr>
+      </w:pPr>
+      <w:r>
+        <w:rPr>
+          <w:sz w:val="22"/>
+          <w:szCs w:val="22"/>
+          <w:highlight w:val="yellow"/>
         </w:rPr>
         <w:t>US014:</w:t>
       </w:r>
@@ -2374,12 +2518,14 @@
         <w:rPr>
           <w:sz w:val="22"/>
           <w:szCs w:val="22"/>
-        </w:rPr>
-      </w:pPr>
-      <w:r>
-        <w:rPr>
-          <w:sz w:val="22"/>
-          <w:szCs w:val="22"/>
+          <w:highlight w:val="yellow"/>
+        </w:rPr>
+      </w:pPr>
+      <w:r>
+        <w:rPr>
+          <w:sz w:val="22"/>
+          <w:szCs w:val="22"/>
+          <w:highlight w:val="yellow"/>
         </w:rPr>
         <w:t>ALS gebruiker</w:t>
       </w:r>
@@ -2401,6 +2547,7 @@
         <w:rPr>
           <w:sz w:val="22"/>
           <w:szCs w:val="22"/>
+          <w:highlight w:val="yellow"/>
         </w:rPr>
         <w:t>WIL IK dat mijn bestanden automatisch versleuteld worden opgeslagen ZODAT IK ze kan bekijken en niemand anders.</w:t>
       </w:r>
@@ -2425,12 +2572,14 @@
         <w:rPr>
           <w:sz w:val="22"/>
           <w:szCs w:val="22"/>
-        </w:rPr>
-      </w:pPr>
-      <w:r>
-        <w:rPr>
-          <w:sz w:val="22"/>
-          <w:szCs w:val="22"/>
+          <w:highlight w:val="yellow"/>
+        </w:rPr>
+      </w:pPr>
+      <w:r>
+        <w:rPr>
+          <w:sz w:val="22"/>
+          <w:szCs w:val="22"/>
+          <w:highlight w:val="yellow"/>
         </w:rPr>
         <w:t>US015:</w:t>
       </w:r>
@@ -2446,12 +2595,14 @@
         <w:rPr>
           <w:sz w:val="22"/>
           <w:szCs w:val="22"/>
-        </w:rPr>
-      </w:pPr>
-      <w:r>
-        <w:rPr>
-          <w:sz w:val="22"/>
-          <w:szCs w:val="22"/>
+          <w:highlight w:val="yellow"/>
+        </w:rPr>
+      </w:pPr>
+      <w:r>
+        <w:rPr>
+          <w:sz w:val="22"/>
+          <w:szCs w:val="22"/>
+          <w:highlight w:val="yellow"/>
         </w:rPr>
         <w:t>ALS admin</w:t>
       </w:r>
@@ -2467,12 +2618,14 @@
         <w:rPr>
           <w:sz w:val="22"/>
           <w:szCs w:val="22"/>
-        </w:rPr>
-      </w:pPr>
-      <w:r>
-        <w:rPr>
-          <w:sz w:val="22"/>
-          <w:szCs w:val="22"/>
+          <w:highlight w:val="yellow"/>
+        </w:rPr>
+      </w:pPr>
+      <w:r>
+        <w:rPr>
+          <w:sz w:val="22"/>
+          <w:szCs w:val="22"/>
+          <w:highlight w:val="yellow"/>
         </w:rPr>
         <w:t xml:space="preserve">WIL IK dat alle </w:t>
       </w:r>
@@ -2480,6 +2633,7 @@
         <w:rPr>
           <w:sz w:val="22"/>
           <w:szCs w:val="22"/>
+          <w:highlight w:val="yellow"/>
         </w:rPr>
         <w:t>wachtwoorden</w:t>
       </w:r>
@@ -2487,6 +2641,7 @@
         <w:rPr>
           <w:sz w:val="22"/>
           <w:szCs w:val="22"/>
+          <w:highlight w:val="yellow"/>
         </w:rPr>
         <w:t xml:space="preserve"> gehas</w:t>
       </w:r>
@@ -2494,6 +2649,7 @@
         <w:rPr>
           <w:sz w:val="22"/>
           <w:szCs w:val="22"/>
+          <w:highlight w:val="yellow"/>
         </w:rPr>
         <w:t>hed worden opgeslagen</w:t>
       </w:r>
@@ -2515,6 +2671,7 @@
         <w:rPr>
           <w:sz w:val="22"/>
           <w:szCs w:val="22"/>
+          <w:highlight w:val="yellow"/>
         </w:rPr>
         <w:t>ZODAT IK mijn gebruikersdata veilig hou.</w:t>
       </w:r>
@@ -2633,12 +2790,14 @@
         <w:rPr>
           <w:sz w:val="22"/>
           <w:szCs w:val="22"/>
-        </w:rPr>
-      </w:pPr>
-      <w:r>
-        <w:rPr>
-          <w:sz w:val="22"/>
-          <w:szCs w:val="22"/>
+          <w:highlight w:val="yellow"/>
+        </w:rPr>
+      </w:pPr>
+      <w:r>
+        <w:rPr>
+          <w:sz w:val="22"/>
+          <w:szCs w:val="22"/>
+          <w:highlight w:val="yellow"/>
         </w:rPr>
         <w:t>US016:</w:t>
       </w:r>
@@ -2654,12 +2813,14 @@
         <w:rPr>
           <w:sz w:val="22"/>
           <w:szCs w:val="22"/>
-        </w:rPr>
-      </w:pPr>
-      <w:r>
-        <w:rPr>
-          <w:sz w:val="22"/>
-          <w:szCs w:val="22"/>
+          <w:highlight w:val="yellow"/>
+        </w:rPr>
+      </w:pPr>
+      <w:r>
+        <w:rPr>
+          <w:sz w:val="22"/>
+          <w:szCs w:val="22"/>
+          <w:highlight w:val="yellow"/>
         </w:rPr>
         <w:t>ALS gebruiker</w:t>
       </w:r>
@@ -2675,12 +2836,14 @@
         <w:rPr>
           <w:sz w:val="22"/>
           <w:szCs w:val="22"/>
-        </w:rPr>
-      </w:pPr>
-      <w:r>
-        <w:rPr>
-          <w:sz w:val="22"/>
-          <w:szCs w:val="22"/>
+          <w:highlight w:val="yellow"/>
+        </w:rPr>
+      </w:pPr>
+      <w:r>
+        <w:rPr>
+          <w:sz w:val="22"/>
+          <w:szCs w:val="22"/>
+          <w:highlight w:val="yellow"/>
         </w:rPr>
         <w:t xml:space="preserve">WIL IK dat er automatisch een nieuwe versie wordt aangemaakt wanneer ik een bestand opnieuw upload </w:t>
       </w:r>
@@ -2702,6 +2865,7 @@
         <w:rPr>
           <w:sz w:val="22"/>
           <w:szCs w:val="22"/>
+          <w:highlight w:val="yellow"/>
         </w:rPr>
         <w:t>ZODAT IK geen data verlies.</w:t>
       </w:r>
@@ -2726,12 +2890,14 @@
         <w:rPr>
           <w:sz w:val="22"/>
           <w:szCs w:val="22"/>
-        </w:rPr>
-      </w:pPr>
-      <w:r>
-        <w:rPr>
-          <w:sz w:val="22"/>
-          <w:szCs w:val="22"/>
+          <w:highlight w:val="yellow"/>
+        </w:rPr>
+      </w:pPr>
+      <w:r>
+        <w:rPr>
+          <w:sz w:val="22"/>
+          <w:szCs w:val="22"/>
+          <w:highlight w:val="yellow"/>
         </w:rPr>
         <w:t>US017</w:t>
       </w:r>
@@ -2739,6 +2905,7 @@
         <w:rPr>
           <w:sz w:val="22"/>
           <w:szCs w:val="22"/>
+          <w:highlight w:val="yellow"/>
         </w:rPr>
         <w:t>:</w:t>
       </w:r>
@@ -2754,12 +2921,14 @@
         <w:rPr>
           <w:sz w:val="22"/>
           <w:szCs w:val="22"/>
-        </w:rPr>
-      </w:pPr>
-      <w:r>
-        <w:rPr>
-          <w:sz w:val="22"/>
-          <w:szCs w:val="22"/>
+          <w:highlight w:val="yellow"/>
+        </w:rPr>
+      </w:pPr>
+      <w:r>
+        <w:rPr>
+          <w:sz w:val="22"/>
+          <w:szCs w:val="22"/>
+          <w:highlight w:val="yellow"/>
         </w:rPr>
         <w:t xml:space="preserve">ALS gebruiker </w:t>
       </w:r>
@@ -2775,12 +2944,14 @@
         <w:rPr>
           <w:sz w:val="22"/>
           <w:szCs w:val="22"/>
-        </w:rPr>
-      </w:pPr>
-      <w:r>
-        <w:rPr>
-          <w:sz w:val="22"/>
-          <w:szCs w:val="22"/>
+          <w:highlight w:val="yellow"/>
+        </w:rPr>
+      </w:pPr>
+      <w:r>
+        <w:rPr>
+          <w:sz w:val="22"/>
+          <w:szCs w:val="22"/>
+          <w:highlight w:val="yellow"/>
         </w:rPr>
         <w:t>WIL IK</w:t>
       </w:r>
@@ -2788,6 +2959,7 @@
         <w:rPr>
           <w:sz w:val="22"/>
           <w:szCs w:val="22"/>
+          <w:highlight w:val="yellow"/>
         </w:rPr>
         <w:t xml:space="preserve"> de gesch</w:t>
       </w:r>
@@ -2795,6 +2967,7 @@
         <w:rPr>
           <w:sz w:val="22"/>
           <w:szCs w:val="22"/>
+          <w:highlight w:val="yellow"/>
         </w:rPr>
         <w:t xml:space="preserve">iedenis van een bestand kunnen bekijken </w:t>
       </w:r>
@@ -2816,6 +2989,7 @@
         <w:rPr>
           <w:sz w:val="22"/>
           <w:szCs w:val="22"/>
+          <w:highlight w:val="yellow"/>
         </w:rPr>
         <w:t>ZODAT IK weet welke wijzigingen er zijn gemaakt.</w:t>
       </w:r>
@@ -2861,12 +3035,14 @@
         <w:rPr>
           <w:sz w:val="22"/>
           <w:szCs w:val="22"/>
-        </w:rPr>
-      </w:pPr>
-      <w:r>
-        <w:rPr>
-          <w:sz w:val="22"/>
-          <w:szCs w:val="22"/>
+          <w:highlight w:val="yellow"/>
+        </w:rPr>
+      </w:pPr>
+      <w:r>
+        <w:rPr>
+          <w:sz w:val="22"/>
+          <w:szCs w:val="22"/>
+          <w:highlight w:val="yellow"/>
         </w:rPr>
         <w:t>ALS gebruiker</w:t>
       </w:r>
@@ -2882,12 +3058,14 @@
         <w:rPr>
           <w:sz w:val="22"/>
           <w:szCs w:val="22"/>
-        </w:rPr>
-      </w:pPr>
-      <w:r>
-        <w:rPr>
-          <w:sz w:val="22"/>
-          <w:szCs w:val="22"/>
+          <w:highlight w:val="yellow"/>
+        </w:rPr>
+      </w:pPr>
+      <w:r>
+        <w:rPr>
+          <w:sz w:val="22"/>
+          <w:szCs w:val="22"/>
+          <w:highlight w:val="yellow"/>
         </w:rPr>
         <w:t>WIL IK eerdere versies van een bestand kunnen downloaden</w:t>
       </w:r>
@@ -2909,6 +3087,7 @@
         <w:rPr>
           <w:sz w:val="22"/>
           <w:szCs w:val="22"/>
+          <w:highlight w:val="yellow"/>
         </w:rPr>
         <w:t>ZODAT IK kan terugkeren naar een vorige versie.</w:t>
       </w:r>
@@ -2933,12 +3112,14 @@
         <w:rPr>
           <w:sz w:val="22"/>
           <w:szCs w:val="22"/>
-        </w:rPr>
-      </w:pPr>
-      <w:r>
-        <w:rPr>
-          <w:sz w:val="22"/>
-          <w:szCs w:val="22"/>
+          <w:highlight w:val="yellow"/>
+        </w:rPr>
+      </w:pPr>
+      <w:r>
+        <w:rPr>
+          <w:sz w:val="22"/>
+          <w:szCs w:val="22"/>
+          <w:highlight w:val="yellow"/>
         </w:rPr>
         <w:t>US019:</w:t>
       </w:r>
@@ -2954,12 +3135,14 @@
         <w:rPr>
           <w:sz w:val="22"/>
           <w:szCs w:val="22"/>
-        </w:rPr>
-      </w:pPr>
-      <w:r>
-        <w:rPr>
-          <w:sz w:val="22"/>
-          <w:szCs w:val="22"/>
+          <w:highlight w:val="yellow"/>
+        </w:rPr>
+      </w:pPr>
+      <w:r>
+        <w:rPr>
+          <w:sz w:val="22"/>
+          <w:szCs w:val="22"/>
+          <w:highlight w:val="yellow"/>
         </w:rPr>
         <w:t xml:space="preserve">ALS </w:t>
       </w:r>
@@ -2967,6 +3150,7 @@
         <w:rPr>
           <w:sz w:val="22"/>
           <w:szCs w:val="22"/>
+          <w:highlight w:val="yellow"/>
         </w:rPr>
         <w:t>admin</w:t>
       </w:r>
@@ -2982,12 +3166,14 @@
         <w:rPr>
           <w:sz w:val="22"/>
           <w:szCs w:val="22"/>
-        </w:rPr>
-      </w:pPr>
-      <w:r>
-        <w:rPr>
-          <w:sz w:val="22"/>
-          <w:szCs w:val="22"/>
+          <w:highlight w:val="yellow"/>
+        </w:rPr>
+      </w:pPr>
+      <w:r>
+        <w:rPr>
+          <w:sz w:val="22"/>
+          <w:szCs w:val="22"/>
+          <w:highlight w:val="yellow"/>
         </w:rPr>
         <w:t xml:space="preserve">WIL IK een complete log kunnen zien van alle gebruikersactiviteiten </w:t>
       </w:r>
@@ -3009,6 +3195,7 @@
         <w:rPr>
           <w:sz w:val="22"/>
           <w:szCs w:val="22"/>
+          <w:highlight w:val="yellow"/>
         </w:rPr>
         <w:t>ZODAT IK het systeem kan monitoren.</w:t>
       </w:r>
@@ -3054,12 +3241,14 @@
         <w:rPr>
           <w:sz w:val="22"/>
           <w:szCs w:val="22"/>
-        </w:rPr>
-      </w:pPr>
-      <w:r>
-        <w:rPr>
-          <w:sz w:val="22"/>
-          <w:szCs w:val="22"/>
+          <w:highlight w:val="yellow"/>
+        </w:rPr>
+      </w:pPr>
+      <w:r>
+        <w:rPr>
+          <w:sz w:val="22"/>
+          <w:szCs w:val="22"/>
+          <w:highlight w:val="yellow"/>
         </w:rPr>
         <w:t xml:space="preserve">ALS gebruiker </w:t>
       </w:r>
@@ -3075,12 +3264,14 @@
         <w:rPr>
           <w:sz w:val="22"/>
           <w:szCs w:val="22"/>
-        </w:rPr>
-      </w:pPr>
-      <w:r>
-        <w:rPr>
-          <w:sz w:val="22"/>
-          <w:szCs w:val="22"/>
+          <w:highlight w:val="yellow"/>
+        </w:rPr>
+      </w:pPr>
+      <w:r>
+        <w:rPr>
+          <w:sz w:val="22"/>
+          <w:szCs w:val="22"/>
+          <w:highlight w:val="yellow"/>
         </w:rPr>
         <w:t xml:space="preserve">WIL IK kunnen zoeken naar bestanden op naam of inhoud </w:t>
       </w:r>
@@ -3102,6 +3293,7 @@
         <w:rPr>
           <w:sz w:val="22"/>
           <w:szCs w:val="22"/>
+          <w:highlight w:val="yellow"/>
         </w:rPr>
         <w:t>ZODAT IK snel documenten kan vinden.</w:t>
       </w:r>
@@ -3126,12 +3318,14 @@
         <w:rPr>
           <w:sz w:val="22"/>
           <w:szCs w:val="22"/>
-        </w:rPr>
-      </w:pPr>
-      <w:r>
-        <w:rPr>
-          <w:sz w:val="22"/>
-          <w:szCs w:val="22"/>
+          <w:highlight w:val="yellow"/>
+        </w:rPr>
+      </w:pPr>
+      <w:r>
+        <w:rPr>
+          <w:sz w:val="22"/>
+          <w:szCs w:val="22"/>
+          <w:highlight w:val="yellow"/>
         </w:rPr>
         <w:t>US021:</w:t>
       </w:r>
@@ -3147,12 +3341,14 @@
         <w:rPr>
           <w:sz w:val="22"/>
           <w:szCs w:val="22"/>
-        </w:rPr>
-      </w:pPr>
-      <w:r>
-        <w:rPr>
-          <w:sz w:val="22"/>
-          <w:szCs w:val="22"/>
+          <w:highlight w:val="yellow"/>
+        </w:rPr>
+      </w:pPr>
+      <w:r>
+        <w:rPr>
+          <w:sz w:val="22"/>
+          <w:szCs w:val="22"/>
+          <w:highlight w:val="yellow"/>
         </w:rPr>
         <w:t xml:space="preserve">ALS </w:t>
       </w:r>
@@ -3160,6 +3356,7 @@
         <w:rPr>
           <w:sz w:val="22"/>
           <w:szCs w:val="22"/>
+          <w:highlight w:val="yellow"/>
         </w:rPr>
         <w:t>gebruiker</w:t>
       </w:r>
@@ -3175,12 +3372,14 @@
         <w:rPr>
           <w:sz w:val="22"/>
           <w:szCs w:val="22"/>
-        </w:rPr>
-      </w:pPr>
-      <w:r>
-        <w:rPr>
-          <w:sz w:val="22"/>
-          <w:szCs w:val="22"/>
+          <w:highlight w:val="yellow"/>
+        </w:rPr>
+      </w:pPr>
+      <w:r>
+        <w:rPr>
+          <w:sz w:val="22"/>
+          <w:szCs w:val="22"/>
+          <w:highlight w:val="yellow"/>
         </w:rPr>
         <w:t xml:space="preserve">WIL IK mijn wachtwoord kunnen resetten via e-mail </w:t>
       </w:r>
@@ -3202,6 +3401,7 @@
         <w:rPr>
           <w:sz w:val="22"/>
           <w:szCs w:val="22"/>
+          <w:highlight w:val="yellow"/>
         </w:rPr>
         <w:t>ZODAT IK toegang behoud as ik mijn wachtwoord vergeet.</w:t>
       </w:r>
@@ -3226,12 +3426,14 @@
         <w:rPr>
           <w:sz w:val="22"/>
           <w:szCs w:val="22"/>
-        </w:rPr>
-      </w:pPr>
-      <w:r>
-        <w:rPr>
-          <w:sz w:val="22"/>
-          <w:szCs w:val="22"/>
+          <w:highlight w:val="yellow"/>
+        </w:rPr>
+      </w:pPr>
+      <w:r>
+        <w:rPr>
+          <w:sz w:val="22"/>
+          <w:szCs w:val="22"/>
+          <w:highlight w:val="yellow"/>
         </w:rPr>
         <w:t>US022:</w:t>
       </w:r>
@@ -3247,12 +3449,14 @@
         <w:rPr>
           <w:sz w:val="22"/>
           <w:szCs w:val="22"/>
-        </w:rPr>
-      </w:pPr>
-      <w:r>
-        <w:rPr>
-          <w:sz w:val="22"/>
-          <w:szCs w:val="22"/>
+          <w:highlight w:val="yellow"/>
+        </w:rPr>
+      </w:pPr>
+      <w:r>
+        <w:rPr>
+          <w:sz w:val="22"/>
+          <w:szCs w:val="22"/>
+          <w:highlight w:val="yellow"/>
         </w:rPr>
         <w:t xml:space="preserve">ALS gebruiker </w:t>
       </w:r>
@@ -3268,12 +3472,14 @@
         <w:rPr>
           <w:sz w:val="22"/>
           <w:szCs w:val="22"/>
-        </w:rPr>
-      </w:pPr>
-      <w:r>
-        <w:rPr>
-          <w:sz w:val="22"/>
-          <w:szCs w:val="22"/>
+          <w:highlight w:val="yellow"/>
+        </w:rPr>
+      </w:pPr>
+      <w:r>
+        <w:rPr>
+          <w:sz w:val="22"/>
+          <w:szCs w:val="22"/>
+          <w:highlight w:val="yellow"/>
         </w:rPr>
         <w:t>WIL IK</w:t>
       </w:r>
@@ -3281,6 +3487,7 @@
         <w:rPr>
           <w:sz w:val="22"/>
           <w:szCs w:val="22"/>
+          <w:highlight w:val="yellow"/>
         </w:rPr>
         <w:t xml:space="preserve"> twee-stappen</w:t>
       </w:r>
@@ -3288,6 +3495,7 @@
         <w:rPr>
           <w:sz w:val="22"/>
           <w:szCs w:val="22"/>
+          <w:highlight w:val="yellow"/>
         </w:rPr>
         <w:t xml:space="preserve"> verificatie kunnen instellen </w:t>
       </w:r>
@@ -3309,6 +3517,7 @@
         <w:rPr>
           <w:sz w:val="22"/>
           <w:szCs w:val="22"/>
+          <w:highlight w:val="yellow"/>
         </w:rPr>
         <w:t>ZODAT IK mijn account extra kan beveiligen.</w:t>
       </w:r>
@@ -3333,12 +3542,14 @@
         <w:rPr>
           <w:sz w:val="22"/>
           <w:szCs w:val="22"/>
-        </w:rPr>
-      </w:pPr>
-      <w:r>
-        <w:rPr>
-          <w:sz w:val="22"/>
-          <w:szCs w:val="22"/>
+          <w:highlight w:val="yellow"/>
+        </w:rPr>
+      </w:pPr>
+      <w:r>
+        <w:rPr>
+          <w:sz w:val="22"/>
+          <w:szCs w:val="22"/>
+          <w:highlight w:val="yellow"/>
         </w:rPr>
         <w:t>US0</w:t>
       </w:r>
@@ -3346,6 +3557,7 @@
         <w:rPr>
           <w:sz w:val="22"/>
           <w:szCs w:val="22"/>
+          <w:highlight w:val="yellow"/>
         </w:rPr>
         <w:t>23:</w:t>
       </w:r>
@@ -3353,6 +3565,7 @@
         <w:rPr>
           <w:sz w:val="22"/>
           <w:szCs w:val="22"/>
+          <w:highlight w:val="yellow"/>
         </w:rPr>
         <w:br/>
       </w:r>
@@ -3360,6 +3573,7 @@
         <w:rPr>
           <w:sz w:val="22"/>
           <w:szCs w:val="22"/>
+          <w:highlight w:val="yellow"/>
         </w:rPr>
         <w:t>ALS gebruiker</w:t>
       </w:r>
@@ -3375,12 +3589,14 @@
         <w:rPr>
           <w:sz w:val="22"/>
           <w:szCs w:val="22"/>
-        </w:rPr>
-      </w:pPr>
-      <w:r>
-        <w:rPr>
-          <w:sz w:val="22"/>
-          <w:szCs w:val="22"/>
+          <w:highlight w:val="yellow"/>
+        </w:rPr>
+      </w:pPr>
+      <w:r>
+        <w:rPr>
+          <w:sz w:val="22"/>
+          <w:szCs w:val="22"/>
+          <w:highlight w:val="yellow"/>
         </w:rPr>
         <w:t xml:space="preserve">WIL IK kunnen inloggen </w:t>
       </w:r>
@@ -3388,6 +3604,7 @@
         <w:rPr>
           <w:sz w:val="22"/>
           <w:szCs w:val="22"/>
+          <w:highlight w:val="yellow"/>
         </w:rPr>
         <w:t xml:space="preserve">met een 2FA-code </w:t>
       </w:r>
@@ -3409,6 +3626,7 @@
         <w:rPr>
           <w:sz w:val="22"/>
           <w:szCs w:val="22"/>
+          <w:highlight w:val="yellow"/>
         </w:rPr>
         <w:t>ZODAT IK alleen toegang heb tot mijn account</w:t>
       </w:r>
@@ -3433,12 +3651,14 @@
         <w:rPr>
           <w:sz w:val="22"/>
           <w:szCs w:val="22"/>
-        </w:rPr>
-      </w:pPr>
-      <w:r>
-        <w:rPr>
-          <w:sz w:val="22"/>
-          <w:szCs w:val="22"/>
+          <w:highlight w:val="yellow"/>
+        </w:rPr>
+      </w:pPr>
+      <w:r>
+        <w:rPr>
+          <w:sz w:val="22"/>
+          <w:szCs w:val="22"/>
+          <w:highlight w:val="yellow"/>
         </w:rPr>
         <w:t>US024:</w:t>
       </w:r>
@@ -3454,12 +3674,14 @@
         <w:rPr>
           <w:sz w:val="22"/>
           <w:szCs w:val="22"/>
-        </w:rPr>
-      </w:pPr>
-      <w:r>
-        <w:rPr>
-          <w:sz w:val="22"/>
-          <w:szCs w:val="22"/>
+          <w:highlight w:val="yellow"/>
+        </w:rPr>
+      </w:pPr>
+      <w:r>
+        <w:rPr>
+          <w:sz w:val="22"/>
+          <w:szCs w:val="22"/>
+          <w:highlight w:val="yellow"/>
         </w:rPr>
         <w:t xml:space="preserve">ALS gebruiker </w:t>
       </w:r>
@@ -3475,12 +3697,14 @@
         <w:rPr>
           <w:sz w:val="22"/>
           <w:szCs w:val="22"/>
-        </w:rPr>
-      </w:pPr>
-      <w:r>
-        <w:rPr>
-          <w:sz w:val="22"/>
-          <w:szCs w:val="22"/>
+          <w:highlight w:val="yellow"/>
+        </w:rPr>
+      </w:pPr>
+      <w:r>
+        <w:rPr>
+          <w:sz w:val="22"/>
+          <w:szCs w:val="22"/>
+          <w:highlight w:val="yellow"/>
         </w:rPr>
         <w:t>WIL IK</w:t>
       </w:r>
@@ -3488,6 +3712,7 @@
         <w:rPr>
           <w:sz w:val="22"/>
           <w:szCs w:val="22"/>
+          <w:highlight w:val="yellow"/>
         </w:rPr>
         <w:t xml:space="preserve"> </w:t>
       </w:r>
@@ -3495,6 +3720,7 @@
         <w:rPr>
           <w:sz w:val="22"/>
           <w:szCs w:val="22"/>
+          <w:highlight w:val="yellow"/>
         </w:rPr>
         <w:t xml:space="preserve">een activiteitenlog van mijn eigen acties kunnen bekijken </w:t>
       </w:r>
@@ -3516,6 +3742,7 @@
         <w:rPr>
           <w:sz w:val="22"/>
           <w:szCs w:val="22"/>
+          <w:highlight w:val="yellow"/>
         </w:rPr>
         <w:t>ZODAT IK kan zien wat er met mijn bestanden is gebeurd.</w:t>
       </w:r>
@@ -3544,32 +3771,24 @@
           <w:lang w:val="nl-BE"/>
         </w:rPr>
         <w:lastRenderedPageBreak/>
-        <w:t>Sprint 3</w:t>
-      </w:r>
-      <w:r>
-        <w:rPr>
-          <w:b/>
-          <w:bCs/>
-          <w:sz w:val="22"/>
-          <w:szCs w:val="22"/>
-          <w:lang w:val="nl-BE"/>
-        </w:rPr>
-        <w:t>:</w:t>
-      </w:r>
-    </w:p>
-    <w:p>
-      <w:pPr>
-        <w:pStyle w:val="ListBullet"/>
-        <w:rPr>
-          <w:sz w:val="22"/>
-          <w:szCs w:val="22"/>
-          <w:lang w:val="nl-BE"/>
-        </w:rPr>
-      </w:pPr>
-      <w:r>
-        <w:rPr>
-          <w:sz w:val="22"/>
-          <w:szCs w:val="22"/>
+        <w:t>Sprint 3:</w:t>
+      </w:r>
+    </w:p>
+    <w:p>
+      <w:pPr>
+        <w:pStyle w:val="ListBullet"/>
+        <w:rPr>
+          <w:sz w:val="22"/>
+          <w:szCs w:val="22"/>
+          <w:highlight w:val="yellow"/>
+          <w:lang w:val="nl-BE"/>
+        </w:rPr>
+      </w:pPr>
+      <w:r>
+        <w:rPr>
+          <w:sz w:val="22"/>
+          <w:szCs w:val="22"/>
+          <w:highlight w:val="yellow"/>
           <w:lang w:val="nl-BE"/>
         </w:rPr>
         <w:t>US025:</w:t>
@@ -3578,6 +3797,7 @@
         <w:rPr>
           <w:sz w:val="22"/>
           <w:szCs w:val="22"/>
+          <w:highlight w:val="yellow"/>
           <w:lang w:val="nl-BE"/>
         </w:rPr>
         <w:br/>
@@ -3587,6 +3807,7 @@
         <w:rPr>
           <w:sz w:val="22"/>
           <w:szCs w:val="22"/>
+          <w:highlight w:val="yellow"/>
           <w:lang w:val="nl-BE"/>
         </w:rPr>
         <w:br/>
@@ -3596,6 +3817,7 @@
         <w:rPr>
           <w:sz w:val="22"/>
           <w:szCs w:val="22"/>
+          <w:highlight w:val="yellow"/>
           <w:lang w:val="nl-BE"/>
         </w:rPr>
         <w:br/>
@@ -3623,13 +3845,15 @@
         <w:rPr>
           <w:sz w:val="22"/>
           <w:szCs w:val="22"/>
-          <w:lang w:val="nl-BE"/>
-        </w:rPr>
-      </w:pPr>
-      <w:r>
-        <w:rPr>
-          <w:sz w:val="22"/>
-          <w:szCs w:val="22"/>
+          <w:highlight w:val="yellow"/>
+          <w:lang w:val="nl-BE"/>
+        </w:rPr>
+      </w:pPr>
+      <w:r>
+        <w:rPr>
+          <w:sz w:val="22"/>
+          <w:szCs w:val="22"/>
+          <w:highlight w:val="yellow"/>
           <w:lang w:val="nl-BE"/>
         </w:rPr>
         <w:t>US026:</w:t>
@@ -3638,6 +3862,7 @@
         <w:rPr>
           <w:sz w:val="22"/>
           <w:szCs w:val="22"/>
+          <w:highlight w:val="yellow"/>
           <w:lang w:val="nl-BE"/>
         </w:rPr>
         <w:br/>
@@ -3647,6 +3872,7 @@
         <w:rPr>
           <w:sz w:val="22"/>
           <w:szCs w:val="22"/>
+          <w:highlight w:val="yellow"/>
           <w:lang w:val="nl-BE"/>
         </w:rPr>
         <w:br/>
@@ -3656,6 +3882,7 @@
         <w:rPr>
           <w:sz w:val="22"/>
           <w:szCs w:val="22"/>
+          <w:highlight w:val="yellow"/>
           <w:lang w:val="nl-BE"/>
         </w:rPr>
         <w:br/>
@@ -3682,13 +3909,15 @@
         <w:rPr>
           <w:sz w:val="22"/>
           <w:szCs w:val="22"/>
-          <w:lang w:val="nl-BE"/>
-        </w:rPr>
-      </w:pPr>
-      <w:r>
-        <w:rPr>
-          <w:sz w:val="22"/>
-          <w:szCs w:val="22"/>
+          <w:highlight w:val="yellow"/>
+          <w:lang w:val="nl-BE"/>
+        </w:rPr>
+      </w:pPr>
+      <w:r>
+        <w:rPr>
+          <w:sz w:val="22"/>
+          <w:szCs w:val="22"/>
+          <w:highlight w:val="yellow"/>
           <w:lang w:val="nl-BE"/>
         </w:rPr>
         <w:t>US027:</w:t>
@@ -3697,6 +3926,7 @@
         <w:rPr>
           <w:sz w:val="22"/>
           <w:szCs w:val="22"/>
+          <w:highlight w:val="yellow"/>
           <w:lang w:val="nl-BE"/>
         </w:rPr>
         <w:br/>
@@ -3706,6 +3936,7 @@
         <w:rPr>
           <w:sz w:val="22"/>
           <w:szCs w:val="22"/>
+          <w:highlight w:val="yellow"/>
           <w:lang w:val="nl-BE"/>
         </w:rPr>
         <w:br/>
@@ -3715,6 +3946,7 @@
         <w:rPr>
           <w:sz w:val="22"/>
           <w:szCs w:val="22"/>
+          <w:highlight w:val="yellow"/>
           <w:lang w:val="nl-BE"/>
         </w:rPr>
         <w:br/>
@@ -3741,13 +3973,15 @@
         <w:rPr>
           <w:sz w:val="22"/>
           <w:szCs w:val="22"/>
-          <w:lang w:val="nl-BE"/>
-        </w:rPr>
-      </w:pPr>
-      <w:r>
-        <w:rPr>
-          <w:sz w:val="22"/>
-          <w:szCs w:val="22"/>
+          <w:highlight w:val="yellow"/>
+          <w:lang w:val="nl-BE"/>
+        </w:rPr>
+      </w:pPr>
+      <w:r>
+        <w:rPr>
+          <w:sz w:val="22"/>
+          <w:szCs w:val="22"/>
+          <w:highlight w:val="yellow"/>
           <w:lang w:val="nl-BE"/>
         </w:rPr>
         <w:t>US028:</w:t>
@@ -3756,6 +3990,7 @@
         <w:rPr>
           <w:sz w:val="22"/>
           <w:szCs w:val="22"/>
+          <w:highlight w:val="yellow"/>
           <w:lang w:val="nl-BE"/>
         </w:rPr>
         <w:br/>
@@ -3765,6 +4000,7 @@
         <w:rPr>
           <w:sz w:val="22"/>
           <w:szCs w:val="22"/>
+          <w:highlight w:val="yellow"/>
           <w:lang w:val="nl-BE"/>
         </w:rPr>
         <w:br/>
@@ -3774,6 +4010,7 @@
         <w:rPr>
           <w:sz w:val="22"/>
           <w:szCs w:val="22"/>
+          <w:highlight w:val="yellow"/>
           <w:lang w:val="nl-BE"/>
         </w:rPr>
         <w:br/>
@@ -3800,13 +4037,15 @@
         <w:rPr>
           <w:sz w:val="22"/>
           <w:szCs w:val="22"/>
-          <w:lang w:val="nl-BE"/>
-        </w:rPr>
-      </w:pPr>
-      <w:r>
-        <w:rPr>
-          <w:sz w:val="22"/>
-          <w:szCs w:val="22"/>
+          <w:highlight w:val="yellow"/>
+          <w:lang w:val="nl-BE"/>
+        </w:rPr>
+      </w:pPr>
+      <w:r>
+        <w:rPr>
+          <w:sz w:val="22"/>
+          <w:szCs w:val="22"/>
+          <w:highlight w:val="yellow"/>
           <w:lang w:val="nl-BE"/>
         </w:rPr>
         <w:t>US029:</w:t>
@@ -3815,6 +4054,7 @@
         <w:rPr>
           <w:sz w:val="22"/>
           <w:szCs w:val="22"/>
+          <w:highlight w:val="yellow"/>
           <w:lang w:val="nl-BE"/>
         </w:rPr>
         <w:br/>
@@ -3824,6 +4064,7 @@
         <w:rPr>
           <w:sz w:val="22"/>
           <w:szCs w:val="22"/>
+          <w:highlight w:val="yellow"/>
           <w:lang w:val="nl-BE"/>
         </w:rPr>
         <w:br/>
@@ -3833,6 +4074,7 @@
         <w:rPr>
           <w:sz w:val="22"/>
           <w:szCs w:val="22"/>
+          <w:highlight w:val="yellow"/>
           <w:lang w:val="nl-BE"/>
         </w:rPr>
         <w:br/>
@@ -3859,13 +4101,15 @@
         <w:rPr>
           <w:sz w:val="22"/>
           <w:szCs w:val="22"/>
-          <w:lang w:val="nl-BE"/>
-        </w:rPr>
-      </w:pPr>
-      <w:r>
-        <w:rPr>
-          <w:sz w:val="22"/>
-          <w:szCs w:val="22"/>
+          <w:highlight w:val="yellow"/>
+          <w:lang w:val="nl-BE"/>
+        </w:rPr>
+      </w:pPr>
+      <w:r>
+        <w:rPr>
+          <w:sz w:val="22"/>
+          <w:szCs w:val="22"/>
+          <w:highlight w:val="yellow"/>
           <w:lang w:val="nl-BE"/>
         </w:rPr>
         <w:t>US030:</w:t>
@@ -3874,6 +4118,7 @@
         <w:rPr>
           <w:sz w:val="22"/>
           <w:szCs w:val="22"/>
+          <w:highlight w:val="yellow"/>
           <w:lang w:val="nl-BE"/>
         </w:rPr>
         <w:br/>
@@ -3883,6 +4128,7 @@
         <w:rPr>
           <w:sz w:val="22"/>
           <w:szCs w:val="22"/>
+          <w:highlight w:val="yellow"/>
           <w:lang w:val="nl-BE"/>
         </w:rPr>
         <w:br/>
@@ -3892,6 +4138,7 @@
         <w:rPr>
           <w:sz w:val="22"/>
           <w:szCs w:val="22"/>
+          <w:highlight w:val="yellow"/>
           <w:lang w:val="nl-BE"/>
         </w:rPr>
         <w:br/>
@@ -3918,13 +4165,15 @@
         <w:rPr>
           <w:sz w:val="22"/>
           <w:szCs w:val="22"/>
-          <w:lang w:val="nl-BE"/>
-        </w:rPr>
-      </w:pPr>
-      <w:r>
-        <w:rPr>
-          <w:sz w:val="22"/>
-          <w:szCs w:val="22"/>
+          <w:highlight w:val="yellow"/>
+          <w:lang w:val="nl-BE"/>
+        </w:rPr>
+      </w:pPr>
+      <w:r>
+        <w:rPr>
+          <w:sz w:val="22"/>
+          <w:szCs w:val="22"/>
+          <w:highlight w:val="yellow"/>
           <w:lang w:val="nl-BE"/>
         </w:rPr>
         <w:t>US031:</w:t>
@@ -3933,6 +4182,7 @@
         <w:rPr>
           <w:sz w:val="22"/>
           <w:szCs w:val="22"/>
+          <w:highlight w:val="yellow"/>
           <w:lang w:val="nl-BE"/>
         </w:rPr>
         <w:br/>
@@ -3942,6 +4192,7 @@
         <w:rPr>
           <w:sz w:val="22"/>
           <w:szCs w:val="22"/>
+          <w:highlight w:val="yellow"/>
           <w:lang w:val="nl-BE"/>
         </w:rPr>
         <w:br/>
@@ -3951,6 +4202,7 @@
         <w:rPr>
           <w:sz w:val="22"/>
           <w:szCs w:val="22"/>
+          <w:highlight w:val="yellow"/>
           <w:lang w:val="nl-BE"/>
         </w:rPr>
         <w:br/>
@@ -3977,13 +4229,15 @@
         <w:rPr>
           <w:sz w:val="22"/>
           <w:szCs w:val="22"/>
-          <w:lang w:val="nl-BE"/>
-        </w:rPr>
-      </w:pPr>
-      <w:r>
-        <w:rPr>
-          <w:sz w:val="22"/>
-          <w:szCs w:val="22"/>
+          <w:highlight w:val="yellow"/>
+          <w:lang w:val="nl-BE"/>
+        </w:rPr>
+      </w:pPr>
+      <w:r>
+        <w:rPr>
+          <w:sz w:val="22"/>
+          <w:szCs w:val="22"/>
+          <w:highlight w:val="yellow"/>
           <w:lang w:val="nl-BE"/>
         </w:rPr>
         <w:t>US032:</w:t>
@@ -3992,6 +4246,7 @@
         <w:rPr>
           <w:sz w:val="22"/>
           <w:szCs w:val="22"/>
+          <w:highlight w:val="yellow"/>
           <w:lang w:val="nl-BE"/>
         </w:rPr>
         <w:br/>
@@ -4001,6 +4256,7 @@
         <w:rPr>
           <w:sz w:val="22"/>
           <w:szCs w:val="22"/>
+          <w:highlight w:val="yellow"/>
           <w:lang w:val="nl-BE"/>
         </w:rPr>
         <w:br/>
@@ -4010,6 +4266,7 @@
         <w:rPr>
           <w:sz w:val="22"/>
           <w:szCs w:val="22"/>
+          <w:highlight w:val="yellow"/>
           <w:lang w:val="nl-BE"/>
         </w:rPr>
         <w:br/>
@@ -4036,13 +4293,15 @@
         <w:rPr>
           <w:sz w:val="22"/>
           <w:szCs w:val="22"/>
-          <w:lang w:val="nl-BE"/>
-        </w:rPr>
-      </w:pPr>
-      <w:r>
-        <w:rPr>
-          <w:sz w:val="22"/>
-          <w:szCs w:val="22"/>
+          <w:highlight w:val="yellow"/>
+          <w:lang w:val="nl-BE"/>
+        </w:rPr>
+      </w:pPr>
+      <w:r>
+        <w:rPr>
+          <w:sz w:val="22"/>
+          <w:szCs w:val="22"/>
+          <w:highlight w:val="yellow"/>
           <w:lang w:val="nl-BE"/>
         </w:rPr>
         <w:t>US033:</w:t>
@@ -4051,6 +4310,7 @@
         <w:rPr>
           <w:sz w:val="22"/>
           <w:szCs w:val="22"/>
+          <w:highlight w:val="yellow"/>
           <w:lang w:val="nl-BE"/>
         </w:rPr>
         <w:br/>
@@ -4060,6 +4320,7 @@
         <w:rPr>
           <w:sz w:val="22"/>
           <w:szCs w:val="22"/>
+          <w:highlight w:val="yellow"/>
           <w:lang w:val="nl-BE"/>
         </w:rPr>
         <w:br/>
@@ -4069,6 +4330,7 @@
         <w:rPr>
           <w:sz w:val="22"/>
           <w:szCs w:val="22"/>
+          <w:highlight w:val="yellow"/>
           <w:lang w:val="nl-BE"/>
         </w:rPr>
         <w:br/>
@@ -4091,13 +4353,15 @@
         <w:rPr>
           <w:sz w:val="22"/>
           <w:szCs w:val="22"/>
-          <w:lang w:val="nl-BE"/>
-        </w:rPr>
-      </w:pPr>
-      <w:r>
-        <w:rPr>
-          <w:sz w:val="22"/>
-          <w:szCs w:val="22"/>
+          <w:highlight w:val="yellow"/>
+          <w:lang w:val="nl-BE"/>
+        </w:rPr>
+      </w:pPr>
+      <w:r>
+        <w:rPr>
+          <w:sz w:val="22"/>
+          <w:szCs w:val="22"/>
+          <w:highlight w:val="yellow"/>
           <w:lang w:val="nl-BE"/>
         </w:rPr>
         <w:t>US034:</w:t>
@@ -4106,6 +4370,7 @@
         <w:rPr>
           <w:sz w:val="22"/>
           <w:szCs w:val="22"/>
+          <w:highlight w:val="yellow"/>
           <w:lang w:val="nl-BE"/>
         </w:rPr>
         <w:br/>
@@ -4115,6 +4380,7 @@
         <w:rPr>
           <w:sz w:val="22"/>
           <w:szCs w:val="22"/>
+          <w:highlight w:val="yellow"/>
           <w:lang w:val="nl-BE"/>
         </w:rPr>
         <w:br/>
@@ -4124,6 +4390,7 @@
         <w:rPr>
           <w:sz w:val="22"/>
           <w:szCs w:val="22"/>
+          <w:highlight w:val="yellow"/>
           <w:lang w:val="nl-BE"/>
         </w:rPr>
         <w:br/>
@@ -4150,13 +4417,15 @@
         <w:rPr>
           <w:sz w:val="22"/>
           <w:szCs w:val="22"/>
-          <w:lang w:val="nl-BE"/>
-        </w:rPr>
-      </w:pPr>
-      <w:r>
-        <w:rPr>
-          <w:sz w:val="22"/>
-          <w:szCs w:val="22"/>
+          <w:highlight w:val="yellow"/>
+          <w:lang w:val="nl-BE"/>
+        </w:rPr>
+      </w:pPr>
+      <w:r>
+        <w:rPr>
+          <w:sz w:val="22"/>
+          <w:szCs w:val="22"/>
+          <w:highlight w:val="yellow"/>
           <w:lang w:val="nl-BE"/>
         </w:rPr>
         <w:t>US035:</w:t>
@@ -4165,6 +4434,7 @@
         <w:rPr>
           <w:sz w:val="22"/>
           <w:szCs w:val="22"/>
+          <w:highlight w:val="yellow"/>
           <w:lang w:val="nl-BE"/>
         </w:rPr>
         <w:br/>
@@ -4174,6 +4444,7 @@
         <w:rPr>
           <w:sz w:val="22"/>
           <w:szCs w:val="22"/>
+          <w:highlight w:val="yellow"/>
           <w:lang w:val="nl-BE"/>
         </w:rPr>
         <w:br/>
@@ -4183,6 +4454,7 @@
         <w:rPr>
           <w:sz w:val="22"/>
           <w:szCs w:val="22"/>
+          <w:highlight w:val="yellow"/>
           <w:lang w:val="nl-BE"/>
         </w:rPr>
         <w:br/>
@@ -4209,13 +4481,15 @@
         <w:rPr>
           <w:sz w:val="22"/>
           <w:szCs w:val="22"/>
-          <w:lang w:val="nl-BE"/>
-        </w:rPr>
-      </w:pPr>
-      <w:r>
-        <w:rPr>
-          <w:sz w:val="22"/>
-          <w:szCs w:val="22"/>
+          <w:highlight w:val="yellow"/>
+          <w:lang w:val="nl-BE"/>
+        </w:rPr>
+      </w:pPr>
+      <w:r>
+        <w:rPr>
+          <w:sz w:val="22"/>
+          <w:szCs w:val="22"/>
+          <w:highlight w:val="yellow"/>
           <w:lang w:val="nl-BE"/>
         </w:rPr>
         <w:t>US036:</w:t>
@@ -4224,6 +4498,7 @@
         <w:rPr>
           <w:sz w:val="22"/>
           <w:szCs w:val="22"/>
+          <w:highlight w:val="yellow"/>
           <w:lang w:val="nl-BE"/>
         </w:rPr>
         <w:br/>
@@ -4233,6 +4508,7 @@
         <w:rPr>
           <w:sz w:val="22"/>
           <w:szCs w:val="22"/>
+          <w:highlight w:val="yellow"/>
           <w:lang w:val="nl-BE"/>
         </w:rPr>
         <w:br/>
@@ -4242,6 +4518,7 @@
         <w:rPr>
           <w:sz w:val="22"/>
           <w:szCs w:val="22"/>
+          <w:highlight w:val="yellow"/>
           <w:lang w:val="nl-BE"/>
         </w:rPr>
         <w:br/>
@@ -4268,13 +4545,15 @@
         <w:rPr>
           <w:sz w:val="22"/>
           <w:szCs w:val="22"/>
-          <w:lang w:val="nl-BE"/>
-        </w:rPr>
-      </w:pPr>
-      <w:r>
-        <w:rPr>
-          <w:sz w:val="22"/>
-          <w:szCs w:val="22"/>
+          <w:highlight w:val="yellow"/>
+          <w:lang w:val="nl-BE"/>
+        </w:rPr>
+      </w:pPr>
+      <w:r>
+        <w:rPr>
+          <w:sz w:val="22"/>
+          <w:szCs w:val="22"/>
+          <w:highlight w:val="yellow"/>
           <w:lang w:val="nl-BE"/>
         </w:rPr>
         <w:t>US037:</w:t>
@@ -4283,6 +4562,7 @@
         <w:rPr>
           <w:sz w:val="22"/>
           <w:szCs w:val="22"/>
+          <w:highlight w:val="yellow"/>
           <w:lang w:val="nl-BE"/>
         </w:rPr>
         <w:br/>
@@ -4292,6 +4572,7 @@
         <w:rPr>
           <w:sz w:val="22"/>
           <w:szCs w:val="22"/>
+          <w:highlight w:val="yellow"/>
           <w:lang w:val="nl-BE"/>
         </w:rPr>
         <w:br/>
@@ -4301,6 +4582,7 @@
         <w:rPr>
           <w:sz w:val="22"/>
           <w:szCs w:val="22"/>
+          <w:highlight w:val="yellow"/>
           <w:lang w:val="nl-BE"/>
         </w:rPr>
         <w:br/>
@@ -4327,13 +4609,15 @@
         <w:rPr>
           <w:sz w:val="22"/>
           <w:szCs w:val="22"/>
-          <w:lang w:val="nl-BE"/>
-        </w:rPr>
-      </w:pPr>
-      <w:r>
-        <w:rPr>
-          <w:sz w:val="22"/>
-          <w:szCs w:val="22"/>
+          <w:highlight w:val="yellow"/>
+          <w:lang w:val="nl-BE"/>
+        </w:rPr>
+      </w:pPr>
+      <w:r>
+        <w:rPr>
+          <w:sz w:val="22"/>
+          <w:szCs w:val="22"/>
+          <w:highlight w:val="yellow"/>
           <w:lang w:val="nl-BE"/>
         </w:rPr>
         <w:t>US038:</w:t>
@@ -4342,6 +4626,7 @@
         <w:rPr>
           <w:sz w:val="22"/>
           <w:szCs w:val="22"/>
+          <w:highlight w:val="yellow"/>
           <w:lang w:val="nl-BE"/>
         </w:rPr>
         <w:br/>
@@ -4351,6 +4636,7 @@
         <w:rPr>
           <w:sz w:val="22"/>
           <w:szCs w:val="22"/>
+          <w:highlight w:val="yellow"/>
           <w:lang w:val="nl-BE"/>
         </w:rPr>
         <w:br/>
@@ -4360,6 +4646,7 @@
         <w:rPr>
           <w:sz w:val="22"/>
           <w:szCs w:val="22"/>
+          <w:highlight w:val="yellow"/>
           <w:lang w:val="nl-BE"/>
         </w:rPr>
         <w:br/>
@@ -4386,13 +4673,15 @@
         <w:rPr>
           <w:sz w:val="22"/>
           <w:szCs w:val="22"/>
-          <w:lang w:val="nl-BE"/>
-        </w:rPr>
-      </w:pPr>
-      <w:r>
-        <w:rPr>
-          <w:sz w:val="22"/>
-          <w:szCs w:val="22"/>
+          <w:highlight w:val="yellow"/>
+          <w:lang w:val="nl-BE"/>
+        </w:rPr>
+      </w:pPr>
+      <w:r>
+        <w:rPr>
+          <w:sz w:val="22"/>
+          <w:szCs w:val="22"/>
+          <w:highlight w:val="yellow"/>
           <w:lang w:val="nl-BE"/>
         </w:rPr>
         <w:t>US039:</w:t>
@@ -4401,6 +4690,7 @@
         <w:rPr>
           <w:sz w:val="22"/>
           <w:szCs w:val="22"/>
+          <w:highlight w:val="yellow"/>
           <w:lang w:val="nl-BE"/>
         </w:rPr>
         <w:br/>
@@ -4410,6 +4700,7 @@
         <w:rPr>
           <w:sz w:val="22"/>
           <w:szCs w:val="22"/>
+          <w:highlight w:val="yellow"/>
           <w:lang w:val="nl-BE"/>
         </w:rPr>
         <w:br/>
@@ -4419,6 +4710,7 @@
         <w:rPr>
           <w:sz w:val="22"/>
           <w:szCs w:val="22"/>
+          <w:highlight w:val="yellow"/>
           <w:lang w:val="nl-BE"/>
         </w:rPr>
         <w:br/>
@@ -4445,13 +4737,15 @@
         <w:rPr>
           <w:sz w:val="22"/>
           <w:szCs w:val="22"/>
-          <w:lang w:val="nl-BE"/>
-        </w:rPr>
-      </w:pPr>
-      <w:r>
-        <w:rPr>
-          <w:sz w:val="22"/>
-          <w:szCs w:val="22"/>
+          <w:highlight w:val="yellow"/>
+          <w:lang w:val="nl-BE"/>
+        </w:rPr>
+      </w:pPr>
+      <w:r>
+        <w:rPr>
+          <w:sz w:val="22"/>
+          <w:szCs w:val="22"/>
+          <w:highlight w:val="yellow"/>
           <w:lang w:val="nl-BE"/>
         </w:rPr>
         <w:t>US040:</w:t>
@@ -4460,6 +4754,7 @@
         <w:rPr>
           <w:sz w:val="22"/>
           <w:szCs w:val="22"/>
+          <w:highlight w:val="yellow"/>
           <w:lang w:val="nl-BE"/>
         </w:rPr>
         <w:br/>
@@ -4469,6 +4764,7 @@
         <w:rPr>
           <w:sz w:val="22"/>
           <w:szCs w:val="22"/>
+          <w:highlight w:val="yellow"/>
           <w:lang w:val="nl-BE"/>
         </w:rPr>
         <w:br/>
@@ -4478,6 +4774,7 @@
         <w:rPr>
           <w:sz w:val="22"/>
           <w:szCs w:val="22"/>
+          <w:highlight w:val="yellow"/>
           <w:lang w:val="nl-BE"/>
         </w:rPr>
         <w:br/>
@@ -5917,6 +6214,7 @@
   <w:style w:type="character" w:default="1" w:styleId="DefaultParagraphFont">
     <w:name w:val="Default Paragraph Font"/>
     <w:uiPriority w:val="1"/>
+    <w:semiHidden/>
     <w:unhideWhenUsed/>
   </w:style>
   <w:style w:type="table" w:default="1" w:styleId="TableNormal">

</xml_diff>